<commit_message>
Updated ssd by removing login() system operation
</commit_message>
<xml_diff>
--- a/Artifacts/UC2.docx
+++ b/Artifacts/UC2.docx
@@ -27,7 +27,18 @@
           <w:rFonts w:ascii="Times New Roman" w:hAnsi="Times New Roman" w:cs="Times New Roman"/>
         </w:rPr>
         <w:tab/>
-        <w:t>Make a referral</w:t>
+      </w:r>
+      <w:r>
+        <w:rPr>
+          <w:rFonts w:ascii="Times New Roman" w:hAnsi="Times New Roman" w:cs="Times New Roman"/>
+        </w:rPr>
+        <w:t>Issue</w:t>
+      </w:r>
+      <w:r>
+        <w:rPr>
+          <w:rFonts w:ascii="Times New Roman" w:hAnsi="Times New Roman" w:cs="Times New Roman"/>
+        </w:rPr>
+        <w:t xml:space="preserve"> a referral</w:t>
       </w:r>
     </w:p>
     <w:p>
@@ -425,13 +436,7 @@
         <w:rPr>
           <w:rFonts w:ascii="Times New Roman" w:hAnsi="Times New Roman" w:cs="Times New Roman"/>
         </w:rPr>
-        <w:t xml:space="preserve">The system changes </w:t>
-      </w:r>
-      <w:r>
-        <w:rPr>
-          <w:rFonts w:ascii="Times New Roman" w:hAnsi="Times New Roman" w:cs="Times New Roman"/>
-        </w:rPr>
-        <w:t xml:space="preserve">the referral status as </w:t>
+        <w:t xml:space="preserve">The system changes the referral status as </w:t>
       </w:r>
       <w:r>
         <w:rPr>
@@ -711,13 +716,14 @@
       </w:pPr>
       <w:r>
         <w:rPr>
+          <w:rFonts w:ascii="Times New Roman" w:hAnsi="Times New Roman" w:cs="Times New Roman"/>
           <w:noProof/>
         </w:rPr>
         <w:drawing>
-          <wp:inline distT="0" distB="0" distL="0" distR="0" wp14:anchorId="11F8FF17" wp14:editId="3749B1EA">
-            <wp:extent cx="5943600" cy="3572933"/>
-            <wp:effectExtent l="0" t="0" r="0" b="0"/>
-            <wp:docPr id="1412102503" name="Picture 1" descr="A screenshot of a diagram&#10;&#10;Description automatically generated"/>
+          <wp:inline distT="0" distB="0" distL="0" distR="0" wp14:anchorId="5D8A4C13" wp14:editId="13948629">
+            <wp:extent cx="6514226" cy="3276600"/>
+            <wp:effectExtent l="0" t="0" r="1270" b="0"/>
+            <wp:docPr id="1420265861" name="Picture 1" descr="A diagram of a diagram&#10;&#10;Description automatically generated with medium confidence"/>
             <wp:cNvGraphicFramePr>
               <a:graphicFrameLocks xmlns:a="http://schemas.openxmlformats.org/drawingml/2006/main" noChangeAspect="1"/>
             </wp:cNvGraphicFramePr>
@@ -725,7 +731,7 @@
               <a:graphicData uri="http://schemas.openxmlformats.org/drawingml/2006/picture">
                 <pic:pic xmlns:pic="http://schemas.openxmlformats.org/drawingml/2006/picture">
                   <pic:nvPicPr>
-                    <pic:cNvPr id="1412102503" name="Picture 1" descr="A screenshot of a diagram&#10;&#10;Description automatically generated"/>
+                    <pic:cNvPr id="1420265861" name="Picture 1" descr="A diagram of a diagram&#10;&#10;Description automatically generated with medium confidence"/>
                     <pic:cNvPicPr/>
                   </pic:nvPicPr>
                   <pic:blipFill>
@@ -743,7 +749,7 @@
                   <pic:spPr>
                     <a:xfrm>
                       <a:off x="0" y="0"/>
-                      <a:ext cx="5951461" cy="3577659"/>
+                      <a:ext cx="6533823" cy="3286457"/>
                     </a:xfrm>
                     <a:prstGeom prst="rect">
                       <a:avLst/>

</xml_diff>